<commit_message>
Šablona osvědčení: nová formulace
</commit_message>
<xml_diff>
--- a/v1.1/download/sablona-osvedceni.docx
+++ b/v1.1/download/sablona-osvedceni.docx
@@ -106,20 +106,20 @@
         <w:rPr>
           <w:sz w:val="24"/>
         </w:rPr>
-        <w:t xml:space="preserve">úspěšně absolvoval/a e-learningový kurz v rozsahu </w:t>
+        <w:t xml:space="preserve">absolvoval/a e-learningový kurz v rozsahu </w:t>
       </w:r>
       <w:r>
         <w:rPr>
           <w:b/>
           <w:sz w:val="24"/>
         </w:rPr>
-        <w:t>6 hodin</w:t>
+        <w:t>8 výukových hodin</w:t>
       </w:r>
       <w:r>
         <w:rPr>
           <w:sz w:val="24"/>
         </w:rPr>
-        <w:t xml:space="preserve"> včetně závěrečného testu.</w:t>
+        <w:t xml:space="preserve"> včetně úspěšného absolvování závěrečného testu.</w:t>
       </w:r>
     </w:p>
     <w:tbl>
@@ -216,7 +216,7 @@
                 <w:color w:val="566A6C"/>
                 <w:sz w:val="20"/>
               </w:rPr>
-              <w:t>Autor kurzu</w:t>
+              <w:t>Autor kurzu a odborný garant</w:t>
             </w:r>
           </w:p>
         </w:tc>
@@ -232,7 +232,7 @@
               <w:rPr>
                 <w:sz w:val="21"/>
               </w:rPr>
-              <w:t>Mgr. Petr Hroch</w:t>
+              <w:t>Mgr. Petr Hroch, psycholog</w:t>
             </w:r>
           </w:p>
         </w:tc>
@@ -321,118 +321,19 @@
         </w:rPr>
       </w:r>
     </w:p>
-    <w:tbl>
-      <w:tblPr>
-        <w:tblW w:type="auto" w:w="0"/>
-        <w:jc w:val="center"/>
-        <w:tblLook w:firstColumn="1" w:firstRow="1" w:lastColumn="0" w:lastRow="0" w:noHBand="0" w:noVBand="1" w:val="04A0"/>
-      </w:tblPr>
-      <w:tblGrid>
-        <w:gridCol w:w="3137"/>
-        <w:gridCol w:w="3137"/>
-        <w:gridCol w:w="3137"/>
-      </w:tblGrid>
-      <w:tr>
-        <w:tc>
-          <w:tcPr>
-            <w:tcW w:type="dxa" w:w="3137"/>
-          </w:tcPr>
-          <w:p>
-            <w:r>
-              <w:rPr>
-                <w:color w:val="566A6C"/>
-              </w:rPr>
-              <w:t>__________________________</w:t>
-            </w:r>
-          </w:p>
-        </w:tc>
-        <w:tc>
-          <w:tcPr>
-            <w:tcW w:type="dxa" w:w="3137"/>
-          </w:tcPr>
-          <w:p>
-            <w:r>
-              <w:rPr>
-                <w:color w:val="566A6C"/>
-              </w:rPr>
-              <w:t>__________________________</w:t>
-            </w:r>
-          </w:p>
-        </w:tc>
-        <w:tc>
-          <w:tcPr>
-            <w:tcW w:type="dxa" w:w="3137"/>
-          </w:tcPr>
-          <w:p>
-            <w:r>
-              <w:rPr>
-                <w:color w:val="566A6C"/>
-              </w:rPr>
-              <w:t>__________________________</w:t>
-            </w:r>
-          </w:p>
-        </w:tc>
-      </w:tr>
-      <w:tr>
-        <w:tc>
-          <w:tcPr>
-            <w:tcW w:type="dxa" w:w="3137"/>
-          </w:tcPr>
-          <w:p>
-            <w:r>
-              <w:rPr>
-                <w:color w:val="566A6C"/>
-                <w:sz w:val="17"/>
-              </w:rPr>
-              <w:t>Podpis účastníka</w:t>
-            </w:r>
-          </w:p>
-        </w:tc>
-        <w:tc>
-          <w:tcPr>
-            <w:tcW w:type="dxa" w:w="3137"/>
-          </w:tcPr>
-          <w:p>
-            <w:r>
-              <w:rPr>
-                <w:color w:val="566A6C"/>
-                <w:sz w:val="17"/>
-              </w:rPr>
-              <w:t>Ověřil/a klíčový pracovník</w:t>
-              <w:br/>
-              <w:t>(jméno, datum, podpis)</w:t>
-            </w:r>
-          </w:p>
-        </w:tc>
-        <w:tc>
-          <w:tcPr>
-            <w:tcW w:type="dxa" w:w="3137"/>
-          </w:tcPr>
-          <w:p>
-            <w:r>
-              <w:rPr>
-                <w:color w:val="566A6C"/>
-                <w:sz w:val="17"/>
-              </w:rPr>
-              <w:t>Za provozovatele</w:t>
-              <w:br/>
-              <w:t>Mgr. Petr Hroch</w:t>
-            </w:r>
-          </w:p>
-        </w:tc>
-      </w:tr>
-    </w:tbl>
     <w:p>
       <w:pPr>
-        <w:spacing w:after="120"/>
+        <w:spacing w:after="360"/>
       </w:pPr>
       <w:r>
         <w:rPr>
           <w:b w:val="0"/>
           <w:i w:val="0"/>
           <w:caps w:val="0"/>
-          <w:sz w:val="8"/>
+          <w:color w:val="566A6C"/>
+          <w:sz w:val="16"/>
         </w:rPr>
+        <w:t>Vzdělávání osob pečujících podle § 47a zákona č. 359/1999 Sb. Osvědčení je platné po ověření klíčovým pracovníkem doprovázející organizace, který posoudí i čestné prohlášení. O započtení do povinných 24 hodin rozhoduje doprovázející organizace. Kontrolní kód slouží k porovnání se záznamem o studiu, nejde o elektronický podpis.</w:t>
       </w:r>
     </w:p>
     <w:p>
@@ -445,9 +346,24 @@
           <w:i w:val="0"/>
           <w:caps w:val="0"/>
           <w:color w:val="566A6C"/>
-          <w:sz w:val="16"/>
+          <w:sz w:val="20"/>
         </w:rPr>
-        <w:t>Vzdělávání osob pečujících podle § 47a zákona č. 359/1999 Sb. Osvědčení je platné po ověření klíčovým pracovníkem doprovázející organizace, který posoudí i čestné prohlášení. O započtení do povinných 24 hodin rozhoduje doprovázející organizace. Kontrolní kód slouží k porovnání se záznamem o studiu, nejde o elektronický podpis.</w:t>
+        <w:t>______________________________</w:t>
+      </w:r>
+    </w:p>
+    <w:p>
+      <w:pPr>
+        <w:spacing w:after="0"/>
+      </w:pPr>
+      <w:r>
+        <w:rPr>
+          <w:b w:val="0"/>
+          <w:i w:val="0"/>
+          <w:caps w:val="0"/>
+          <w:color w:val="566A6C"/>
+          <w:sz w:val="17"/>
+        </w:rPr>
+        <w:t>Ověřil/a klíčový pracovník (jméno, datum, podpis)</w:t>
       </w:r>
     </w:p>
     <w:p>

</xml_diff>

<commit_message>
Rozsah 8 astronomických hodin (60 min), čas po hodinách, bez výukových hodin a minut
</commit_message>
<xml_diff>
--- a/v1.1/download/sablona-osvedceni.docx
+++ b/v1.1/download/sablona-osvedceni.docx
@@ -113,7 +113,7 @@
           <w:b/>
           <w:sz w:val="24"/>
         </w:rPr>
-        <w:t>8 výukových hodin</w:t>
+        <w:t>8 hodin</w:t>
       </w:r>
       <w:r>
         <w:rPr>
@@ -425,7 +425,7 @@
           <w:caps w:val="0"/>
           <w:sz w:val="21"/>
         </w:rPr>
-        <w:t>• Osvědčení vydávejte jen účastníkům, kteří splnili podmínky kurzu: všechny kapitoly (aspoň 60 % obsahu nebo času), závěrečný test aspoň na 60 %, aktivní čas aspoň 180 minut a hodnocení kurzu. Zbývající čas do 360 minut doloží účastník čestným prohlášením, které ověří klíčový pracovník.</w:t>
+        <w:t>• Osvědčení vydávejte jen účastníkům, kteří splnili podmínky kurzu: všechny kapitoly (aspoň 60 % obsahu nebo času), závěrečný test aspoň na 60 %, aktivní čas aspoň 4 hodiny a hodnocení kurzu. Zbývající čas do 8 hodin doloží účastník čestným prohlášením, které ověří klíčový pracovník.</w:t>
       </w:r>
     </w:p>
     <w:p>

</xml_diff>

<commit_message>
Splnění podle navštívených stránek a testů, bez měření času a čestného prohlášení; velká písmena po dvojtečce
</commit_message>
<xml_diff>
--- a/v1.1/download/sablona-osvedceni.docx
+++ b/v1.1/download/sablona-osvedceni.docx
@@ -333,7 +333,7 @@
           <w:color w:val="566A6C"/>
           <w:sz w:val="16"/>
         </w:rPr>
-        <w:t>Vzdělávání osob pečujících podle § 47a zákona č. 359/1999 Sb. Osvědčení je platné po ověření klíčovým pracovníkem doprovázející organizace, který posoudí i čestné prohlášení. O započtení do povinných 24 hodin rozhoduje doprovázející organizace. Kontrolní kód slouží k porovnání se záznamem o studiu, nejde o elektronický podpis.</w:t>
+        <w:t>Vzdělávání osob pečujících podle § 47a zákona č. 359/1999 Sb. Osvědčení je platné po ověření klíčovým pracovníkem doprovázející organizace. O započtení do povinných 24 hodin rozhoduje doprovázející organizace. Kontrolní kód slouží k porovnání se záznamem o studiu, nejde o elektronický podpis.</w:t>
       </w:r>
     </w:p>
     <w:p>
@@ -425,7 +425,7 @@
           <w:caps w:val="0"/>
           <w:sz w:val="21"/>
         </w:rPr>
-        <w:t>• Osvědčení vydávejte jen účastníkům, kteří splnili podmínky kurzu: všechny kapitoly (aspoň 60 % obsahu nebo času), závěrečný test aspoň na 60 %, aktivní čas aspoň 4 hodiny a hodnocení kurzu. Zbývající čas do 8 hodin doloží účastník čestným prohlášením, které ověří klíčový pracovník.</w:t>
+        <w:t>• Osvědčení vydávejte jen účastníkům, kteří splnili podmínky kurzu: všechny kapitoly (otevřít všechny stránky a splnit kontrolní testy kapitol), závěrečný test aspoň na 60 % a hodnocení kurzu. Čas se neměří, rozsah 8 hodin je odborný odhad.</w:t>
       </w:r>
     </w:p>
     <w:p>

</xml_diff>